<commit_message>
Multiple changes & optimizations
</commit_message>
<xml_diff>
--- a/template.docx
+++ b/template.docx
@@ -111,6 +111,14 @@
           <w:szCs w:val="24"/>
         </w:rPr>
         <w:tab/>
+      </w:r>
+      <w:r>
+        <w:rPr>
+          <w:sz w:val="24"/>
+          <w:szCs w:val="24"/>
+          <w:lang w:val="en-GB"/>
+        </w:rPr>
+        <w:t>DATE</w:t>
       </w:r>
     </w:p>
     <w:p>
@@ -217,7 +225,22 @@
           <w:sz w:val="24"/>
           <w:szCs w:val="24"/>
         </w:rPr>
-        <w:t>лазер 980 </w:t>
+        <w:t xml:space="preserve">лазер </w:t>
+      </w:r>
+      <w:r>
+        <w:rPr>
+          <w:sz w:val="24"/>
+          <w:szCs w:val="24"/>
+          <w:lang w:val="en-US"/>
+        </w:rPr>
+        <w:t>wlength</w:t>
+      </w:r>
+      <w:r>
+        <w:rPr>
+          <w:sz w:val="24"/>
+          <w:szCs w:val="24"/>
+        </w:rPr>
+        <w:t> </w:t>
       </w:r>
       <w:proofErr w:type="spellStart"/>
       <w:r>
@@ -235,19 +258,22 @@
         </w:rPr>
         <w:t xml:space="preserve"> </w:t>
       </w:r>
-      <w:r>
-        <w:rPr>
-          <w:sz w:val="24"/>
-          <w:szCs w:val="24"/>
-        </w:rPr>
-        <w:t>8</w:t>
-      </w:r>
-      <w:r>
-        <w:rPr>
-          <w:sz w:val="24"/>
-          <w:szCs w:val="24"/>
-        </w:rPr>
-        <w:t> мВт</w:t>
+      <w:proofErr w:type="spellStart"/>
+      <w:r>
+        <w:rPr>
+          <w:sz w:val="24"/>
+          <w:szCs w:val="24"/>
+          <w:lang w:val="en-US"/>
+        </w:rPr>
+        <w:t>mvalue</w:t>
+      </w:r>
+      <w:proofErr w:type="spellEnd"/>
+      <w:r>
+        <w:rPr>
+          <w:sz w:val="24"/>
+          <w:szCs w:val="24"/>
+        </w:rPr>
+        <w:t>Вт</w:t>
       </w:r>
       <w:r>
         <w:rPr>
@@ -329,43 +355,8 @@
           <w:szCs w:val="24"/>
         </w:rPr>
       </w:pPr>
-      <w:r>
-        <w:rPr>
-          <w:sz w:val="24"/>
-          <w:szCs w:val="24"/>
-        </w:rPr>
-        <w:t xml:space="preserve">обтюратор </w:t>
-      </w:r>
-      <w:proofErr w:type="spellStart"/>
-      <w:r>
-        <w:rPr>
-          <w:sz w:val="24"/>
-          <w:szCs w:val="24"/>
-        </w:rPr>
-        <w:t>Thorlabs</w:t>
-      </w:r>
-      <w:proofErr w:type="spellEnd"/>
-      <w:r>
-        <w:rPr>
-          <w:sz w:val="24"/>
-          <w:szCs w:val="24"/>
-        </w:rPr>
-        <w:t xml:space="preserve"> MC2000B-EC;</w:t>
-      </w:r>
-    </w:p>
-    <w:p>
-      <w:pPr>
-        <w:numPr>
-          <w:ilvl w:val="0"/>
-          <w:numId w:val="2"/>
-        </w:numPr>
-        <w:spacing w:before="144"/>
-        <w:ind w:left="0" w:firstLine="0"/>
-        <w:rPr>
-          <w:sz w:val="24"/>
-          <w:szCs w:val="24"/>
-        </w:rPr>
-      </w:pPr>
+      <w:bookmarkStart w:id="0" w:name="_GoBack"/>
+      <w:bookmarkEnd w:id="0"/>
       <w:r>
         <w:rPr>
           <w:sz w:val="24"/>
@@ -709,16 +700,7 @@
                 <w:b/>
                 <w:vertAlign w:val="subscript"/>
               </w:rPr>
-              <w:t>ди</w:t>
-            </w:r>
-            <w:bookmarkStart w:id="0" w:name="_GoBack"/>
-            <w:bookmarkEnd w:id="0"/>
-            <w:r>
-              <w:rPr>
-                <w:b/>
-                <w:vertAlign w:val="subscript"/>
-              </w:rPr>
-              <w:t>фф</w:t>
+              <w:t>дифф</w:t>
             </w:r>
             <w:r>
               <w:rPr>

</xml_diff>